<commit_message>
just ignore my commits please
</commit_message>
<xml_diff>
--- a/Project Report/Project Report_HCI_GPA & CGPA Calculation System.docx
+++ b/Project Report/Project Report_HCI_GPA & CGPA Calculation System.docx
@@ -16780,14 +16780,21 @@
         <w:spacing w:line="360" w:lineRule="auto"/>
       </w:pPr>
       <w:r>
-        <w:t xml:space="preserve">Link: </w:t>
+        <w:rPr>
+          <w:b/>
+          <w:bCs/>
+        </w:rPr>
+        <w:t>Link:</w:t>
+      </w:r>
+      <w:r>
+        <w:t xml:space="preserve"> </w:t>
       </w:r>
       <w:hyperlink r:id="rId26" w:history="1">
         <w:r>
           <w:rPr>
             <w:rStyle w:val="Hyperlink"/>
           </w:rPr>
-          <w:t>https://hci-project-two-psi.vercel.app/</w:t>
+          <w:t>https://gpa-cgpa-calculation-web.vercel.app/</w:t>
         </w:r>
       </w:hyperlink>
     </w:p>
@@ -17750,7 +17757,7 @@
         </w:rPr>
         <w:lastRenderedPageBreak/>
         <w:drawing>
-          <wp:inline distT="0" distB="0" distL="0" distR="0" wp14:anchorId="18E420C0" wp14:editId="476C2558">
+          <wp:inline distT="0" distB="0" distL="0" distR="0" wp14:anchorId="18E420C0" wp14:editId="3D1EB638">
             <wp:extent cx="2531038" cy="5479073"/>
             <wp:effectExtent l="19050" t="19050" r="22225" b="26670"/>
             <wp:docPr id="31" name="Picture 31"/>

</xml_diff>